<commit_message>
Implement 2025 regulation question bank template, parser, unit-split rules, and paper generation
</commit_message>
<xml_diff>
--- a/backend/templates/Question_Bank_Template.docx
+++ b/backend/templates/Question_Bank_Template.docx
@@ -182,27 +182,17 @@
         <w:jc w:val="left"/>
       </w:pPr>
       <w:r>
-        <w:rPr>
-          <w:spacing w:val="-2"/>
-        </w:rPr>
         <w:t>Regulation</w:t>
-      </w:r>
-      <w:r>
         <w:tab/>
         <w:t>:</w:t>
-      </w:r>
-      <w:r>
-        <w:rPr>
-          <w:b w:val="0"/>
-          <w:sz w:val="22"/>
-        </w:rPr>
         <w:tab/>
-      </w:r>
-      <w:r>
-        <w:rPr>
-          <w:spacing w:val="1"/>
-        </w:rPr>
-        <w:t xml:space="preserve"> </w:t>
+        <w:t>2021</w:t>
+        <w:tab/>
+        <w:tab/>
+        <w:t>No. of Units</w:t>
+        <w:tab/>
+        <w:t>:</w:t>
+        <w:tab/>
       </w:r>
     </w:p>
     <w:p>
@@ -9674,37 +9664,7 @@
         <w:ind w:left="0" w:right="492"/>
       </w:pPr>
       <w:r>
-        <w:rPr>
-          <w:color w:val="212121"/>
-        </w:rPr>
-        <w:t>UNIT</w:t>
-      </w:r>
-      <w:r>
-        <w:rPr>
-          <w:color w:val="212121"/>
-          <w:spacing w:val="3"/>
-        </w:rPr>
-        <w:t xml:space="preserve"> </w:t>
-      </w:r>
-      <w:r>
-        <w:rPr>
-          <w:color w:val="212121"/>
-          <w:spacing w:val="-5"/>
-        </w:rPr>
-        <w:t>V:</w:t>
-      </w:r>
-      <w:r>
-        <w:rPr>
-          <w:color w:val="212121"/>
-        </w:rPr>
-        <w:tab/>
-      </w:r>
-      <w:r>
-        <w:rPr>
-          <w:color w:val="212121"/>
-          <w:spacing w:val="-10"/>
-        </w:rPr>
-        <w:t>7</w:t>
+        <w:t>UNIT V:</w:t>
       </w:r>
     </w:p>
     <w:p>

</xml_diff>